<commit_message>
fest: Exercices Thursday made
</commit_message>
<xml_diff>
--- a/exercices/db-audit/e-183-ALL-StoredProcedure.docx
+++ b/exercices/db-audit/e-183-ALL-StoredProcedure.docx
@@ -1,6 +1,6 @@
 
 <file path=word/document.xml><?xml version="1.0" encoding="utf-8"?>
-<w:document xmlns:wpc="http://schemas.microsoft.com/office/word/2010/wordprocessingCanvas" xmlns:cx="http://schemas.microsoft.com/office/drawing/2014/chartex" xmlns:cx1="http://schemas.microsoft.com/office/drawing/2015/9/8/chartex" xmlns:cx2="http://schemas.microsoft.com/office/drawing/2015/10/21/chartex" xmlns:cx3="http://schemas.microsoft.com/office/drawing/2016/5/9/chartex" xmlns:cx4="http://schemas.microsoft.com/office/drawing/2016/5/10/chartex" xmlns:cx5="http://schemas.microsoft.com/office/drawing/2016/5/11/chartex" xmlns:cx6="http://schemas.microsoft.com/office/drawing/2016/5/12/chartex" xmlns:cx7="http://schemas.microsoft.com/office/drawing/2016/5/13/chartex" xmlns:cx8="http://schemas.microsoft.com/office/drawing/2016/5/14/chartex" xmlns:mc="http://schemas.openxmlformats.org/markup-compatibility/2006" xmlns:aink="http://schemas.microsoft.com/office/drawing/2016/ink" xmlns:am3d="http://schemas.microsoft.com/office/drawing/2017/model3d" xmlns:o="urn:schemas-microsoft-com:office:office" xmlns:oel="http://schemas.microsoft.com/office/2019/extlst" xmlns:r="http://schemas.openxmlformats.org/officeDocument/2006/relationships" xmlns:m="http://schemas.openxmlformats.org/officeDocument/2006/math" xmlns:v="urn:schemas-microsoft-com:vml" xmlns:wp14="http://schemas.microsoft.com/office/word/2010/wordprocessingDrawing" xmlns:wp="http://schemas.openxmlformats.org/drawingml/2006/wordprocessingDrawing" xmlns:w10="urn:schemas-microsoft-com:office:word" xmlns:w="http://schemas.openxmlformats.org/wordprocessingml/2006/main" xmlns:w14="http://schemas.microsoft.com/office/word/2010/wordml" xmlns:w15="http://schemas.microsoft.com/office/word/2012/wordml" xmlns:w16cex="http://schemas.microsoft.com/office/word/2018/wordml/cex" xmlns:w16cid="http://schemas.microsoft.com/office/word/2016/wordml/cid" xmlns:w16="http://schemas.microsoft.com/office/word/2018/wordml" xmlns:w16du="http://schemas.microsoft.com/office/word/2023/wordml/word16du" xmlns:w16sdtdh="http://schemas.microsoft.com/office/word/2020/wordml/sdtdatahash" xmlns:w16sdtfl="http://schemas.microsoft.com/office/word/2024/wordml/sdtformatlock" xmlns:w16se="http://schemas.microsoft.com/office/word/2015/wordml/symex" xmlns:wpg="http://schemas.microsoft.com/office/word/2010/wordprocessingGroup" xmlns:wpi="http://schemas.microsoft.com/office/word/2010/wordprocessingInk" xmlns:wne="http://schemas.microsoft.com/office/word/2006/wordml" xmlns:wps="http://schemas.microsoft.com/office/word/2010/wordprocessingShape" mc:Ignorable="w14 w15 w16se w16cid w16 w16cex w16sdtdh w16sdtfl w16du wp14">
+<w:document xmlns:wpc="http://schemas.microsoft.com/office/word/2010/wordprocessingCanvas" xmlns:cx="http://schemas.microsoft.com/office/drawing/2014/chartex" xmlns:cx1="http://schemas.microsoft.com/office/drawing/2015/9/8/chartex" xmlns:cx2="http://schemas.microsoft.com/office/drawing/2015/10/21/chartex" xmlns:cx3="http://schemas.microsoft.com/office/drawing/2016/5/9/chartex" xmlns:cx4="http://schemas.microsoft.com/office/drawing/2016/5/10/chartex" xmlns:cx5="http://schemas.microsoft.com/office/drawing/2016/5/11/chartex" xmlns:cx6="http://schemas.microsoft.com/office/drawing/2016/5/12/chartex" xmlns:cx7="http://schemas.microsoft.com/office/drawing/2016/5/13/chartex" xmlns:cx8="http://schemas.microsoft.com/office/drawing/2016/5/14/chartex" xmlns:mc="http://schemas.openxmlformats.org/markup-compatibility/2006" xmlns:aink="http://schemas.microsoft.com/office/drawing/2016/ink" xmlns:am3d="http://schemas.microsoft.com/office/drawing/2017/model3d" xmlns:o="urn:schemas-microsoft-com:office:office" xmlns:oel="http://schemas.microsoft.com/office/2019/extlst" xmlns:r="http://schemas.openxmlformats.org/officeDocument/2006/relationships" xmlns:m="http://schemas.openxmlformats.org/officeDocument/2006/math" xmlns:v="urn:schemas-microsoft-com:vml" xmlns:wp14="http://schemas.microsoft.com/office/word/2010/wordprocessingDrawing" xmlns:wp="http://schemas.openxmlformats.org/drawingml/2006/wordprocessingDrawing" xmlns:w10="urn:schemas-microsoft-com:office:word" xmlns:w="http://schemas.openxmlformats.org/wordprocessingml/2006/main" xmlns:w14="http://schemas.microsoft.com/office/word/2010/wordml" xmlns:w15="http://schemas.microsoft.com/office/word/2012/wordml" xmlns:w16cex="http://schemas.microsoft.com/office/word/2018/wordml/cex" xmlns:w16cid="http://schemas.microsoft.com/office/word/2016/wordml/cid" xmlns:w16="http://schemas.microsoft.com/office/word/2018/wordml" xmlns:w16sdtdh="http://schemas.microsoft.com/office/word/2020/wordml/sdtdatahash" xmlns:w16se="http://schemas.microsoft.com/office/word/2015/wordml/symex" xmlns:wpg="http://schemas.microsoft.com/office/word/2010/wordprocessingGroup" xmlns:wpi="http://schemas.microsoft.com/office/word/2010/wordprocessingInk" xmlns:wne="http://schemas.microsoft.com/office/word/2006/wordml" xmlns:wps="http://schemas.microsoft.com/office/word/2010/wordprocessingShape" mc:Ignorable="w14 w15 w16se w16cid w16 w16cex w16sdtdh wp14">
   <w:body>
     <w:p>
       <w:pPr>
@@ -676,17 +676,35 @@
     </w:p>
     <w:p>
       <w:r>
-        <w:t>IN : ce mot-clé est utilisé pour définir un paramètre d'entrée pour la procédure stockée. Les valeurs peuvent être passées à la procédure stockée en utilisant des arguments au moment de l'appel de la procédure. Les paramètres IN ne peuvent pas être modifiés par la procédure stockée.</w:t>
-      </w:r>
-    </w:p>
-    <w:p>
-      <w:r>
-        <w:t>OUT : ce mot-clé est utilisé pour définir un paramètre de sortie pour la procédure stockée. Les valeurs de ces paramètres sont définies par la procédure stockée et retournées à l'appelant à la fin de l'exécution de la procédure. Les paramètres OUT ne sont pas utilisés pour passer des valeurs à la procédure.</w:t>
-      </w:r>
-    </w:p>
-    <w:p>
-      <w:r>
-        <w:t>INOUT : ce mot-clé est utilisé pour définir un paramètre qui est à la fois d'entrée et de sortie pour la procédure stockée. Les valeurs peuvent être passées à la procédure stockée en utilisant des arguments au moment de l'appel, et la procédure stockée peut également modifier les valeurs de ces paramètres. Les paramètres INOUT sont utiles pour les scénarios où la procédure stockée doit renvoyer une valeur calculée qui dépend de la valeur d'entrée.</w:t>
+        <w:rPr>
+          <w:highlight w:val="yellow"/>
+        </w:rPr>
+        <w:t>IN</w:t>
+      </w:r>
+      <w:r>
+        <w:t xml:space="preserve"> : ce mot-clé est utilisé pour définir un paramètre d'entrée pour la procédure stockée. Les valeurs peuvent être passées à la procédure stockée en utilisant des arguments au moment de l'appel de la procédure. Les paramètres IN ne peuvent pas être modifiés par la procédure stockée.</w:t>
+      </w:r>
+    </w:p>
+    <w:p>
+      <w:r>
+        <w:rPr>
+          <w:highlight w:val="yellow"/>
+        </w:rPr>
+        <w:t>OUT</w:t>
+      </w:r>
+      <w:r>
+        <w:t xml:space="preserve"> : ce mot-clé est utilisé pour définir un paramètre de sortie pour la procédure stockée. Les valeurs de ces paramètres sont définies par la procédure stockée et retournées à l'appelant à la fin de l'exécution de la procédure. Les paramètres OUT ne sont pas utilisés pour passer des valeurs à la procédure.</w:t>
+      </w:r>
+    </w:p>
+    <w:p>
+      <w:r>
+        <w:rPr>
+          <w:highlight w:val="yellow"/>
+        </w:rPr>
+        <w:t>INOUT</w:t>
+      </w:r>
+      <w:r>
+        <w:t xml:space="preserve"> : ce mot-clé est utilisé pour définir un paramètre qui est à la fois d'entrée et de sortie pour la procédure stockée. Les valeurs peuvent être passées à la procédure stockée en utilisant des arguments au moment de l'appel, et la procédure stockée peut également modifier les valeurs de ces paramètres. Les paramètres INOUT sont utiles pour les scénarios où la procédure stockée doit renvoyer une valeur calculée qui dépend de la valeur d'entrée.</w:t>
       </w:r>
     </w:p>
     <w:p>
@@ -711,7 +729,15 @@
         <w:t>Ouvrez PHPMyAdmin</w:t>
       </w:r>
       <w:r>
-        <w:t>, créez une base de données « db_test »</w:t>
+        <w:t>, créez une base de données « </w:t>
+      </w:r>
+      <w:proofErr w:type="spellStart"/>
+      <w:r>
+        <w:t>db_test</w:t>
+      </w:r>
+      <w:proofErr w:type="spellEnd"/>
+      <w:r>
+        <w:t> »</w:t>
       </w:r>
       <w:r>
         <w:t xml:space="preserve"> et alle</w:t>
@@ -728,11 +754,69 @@
       <w:r>
         <w:t xml:space="preserve">. </w:t>
       </w:r>
-      <w:r>
-        <w:rPr>
-          <w:lang w:val="en-US"/>
-        </w:rPr>
-        <w:t>Ajoutez cette procédure stockée :</w:t>
+      <w:proofErr w:type="spellStart"/>
+      <w:r>
+        <w:rPr>
+          <w:lang w:val="en-US"/>
+        </w:rPr>
+        <w:t>Ajoutez</w:t>
+      </w:r>
+      <w:proofErr w:type="spellEnd"/>
+      <w:r>
+        <w:rPr>
+          <w:lang w:val="en-US"/>
+        </w:rPr>
+        <w:t xml:space="preserve"> </w:t>
+      </w:r>
+      <w:proofErr w:type="spellStart"/>
+      <w:r>
+        <w:rPr>
+          <w:lang w:val="en-US"/>
+        </w:rPr>
+        <w:t>cette</w:t>
+      </w:r>
+      <w:proofErr w:type="spellEnd"/>
+      <w:r>
+        <w:rPr>
+          <w:lang w:val="en-US"/>
+        </w:rPr>
+        <w:t xml:space="preserve"> </w:t>
+      </w:r>
+      <w:proofErr w:type="spellStart"/>
+      <w:r>
+        <w:rPr>
+          <w:lang w:val="en-US"/>
+        </w:rPr>
+        <w:t>procédure</w:t>
+      </w:r>
+      <w:proofErr w:type="spellEnd"/>
+      <w:r>
+        <w:rPr>
+          <w:lang w:val="en-US"/>
+        </w:rPr>
+        <w:t xml:space="preserve"> </w:t>
+      </w:r>
+      <w:proofErr w:type="spellStart"/>
+      <w:proofErr w:type="gramStart"/>
+      <w:r>
+        <w:rPr>
+          <w:lang w:val="en-US"/>
+        </w:rPr>
+        <w:t>stockée</w:t>
+      </w:r>
+      <w:proofErr w:type="spellEnd"/>
+      <w:r>
+        <w:rPr>
+          <w:lang w:val="en-US"/>
+        </w:rPr>
+        <w:t> :</w:t>
+      </w:r>
+      <w:proofErr w:type="gramEnd"/>
+      <w:r>
+        <w:rPr>
+          <w:lang w:val="en-US"/>
+        </w:rPr>
+        <w:t xml:space="preserve"> </w:t>
       </w:r>
     </w:p>
     <w:p>
@@ -804,20 +888,31 @@
         </w:rPr>
         <w:t xml:space="preserve"> </w:t>
       </w:r>
+      <w:proofErr w:type="spellStart"/>
       <w:r>
         <w:rPr>
           <w:rStyle w:val="CodeHTML"/>
           <w:lang w:val="en-US"/>
         </w:rPr>
-        <w:t>sp_helloWorld</w:t>
-      </w:r>
+        <w:t>sp_</w:t>
+      </w:r>
+      <w:proofErr w:type="gramStart"/>
       <w:r>
         <w:rPr>
           <w:rStyle w:val="CodeHTML"/>
           <w:lang w:val="en-US"/>
         </w:rPr>
+        <w:t>helloWorld</w:t>
+      </w:r>
+      <w:proofErr w:type="spellEnd"/>
+      <w:r>
+        <w:rPr>
+          <w:rStyle w:val="CodeHTML"/>
+          <w:lang w:val="en-US"/>
+        </w:rPr>
         <w:t>(</w:t>
       </w:r>
+      <w:proofErr w:type="gramEnd"/>
       <w:r>
         <w:rPr>
           <w:rStyle w:val="hljs-keyword"/>
@@ -927,7 +1022,15 @@
           <w:rStyle w:val="hljs-string"/>
           <w:lang w:val="en-US"/>
         </w:rPr>
-        <w:t>'Bonjour le monde'</w:t>
+        <w:t>'Bonjour le monde</w:t>
+      </w:r>
+      <w:proofErr w:type="gramStart"/>
+      <w:r>
+        <w:rPr>
+          <w:rStyle w:val="hljs-string"/>
+          <w:lang w:val="en-US"/>
+        </w:rPr>
+        <w:t>'</w:t>
       </w:r>
       <w:r>
         <w:rPr>
@@ -936,6 +1039,7 @@
         </w:rPr>
         <w:t>;</w:t>
       </w:r>
+      <w:proofErr w:type="gramEnd"/>
     </w:p>
     <w:p>
       <w:pPr>
@@ -984,6 +1088,7 @@
           <w:lang w:val="en-US"/>
         </w:rPr>
       </w:pPr>
+      <w:proofErr w:type="gramStart"/>
       <w:r>
         <w:rPr>
           <w:rStyle w:val="CodeHTML"/>
@@ -991,6 +1096,7 @@
         </w:rPr>
         <w:t>DELIMITER ;</w:t>
       </w:r>
+      <w:proofErr w:type="gramEnd"/>
     </w:p>
     <w:p>
       <w:pPr>
@@ -1005,7 +1111,15 @@
       </w:r>
       <w:r>
         <w:br/>
-        <w:t>CALL sp_helloWorld(@message) ;</w:t>
+        <w:t xml:space="preserve">CALL </w:t>
+      </w:r>
+      <w:proofErr w:type="spellStart"/>
+      <w:r>
+        <w:t>sp_helloWorld</w:t>
+      </w:r>
+      <w:proofErr w:type="spellEnd"/>
+      <w:r>
+        <w:t>(@message) ;</w:t>
       </w:r>
     </w:p>
     <w:p>
@@ -1146,6 +1260,147 @@
     </w:p>
     <w:p>
       <w:pPr>
+        <w:spacing w:after="0"/>
+        <w:rPr>
+          <w:b/>
+          <w:bCs/>
+        </w:rPr>
+      </w:pPr>
+      <w:r>
+        <w:rPr>
+          <w:b/>
+          <w:bCs/>
+        </w:rPr>
+        <w:t xml:space="preserve">DEFINER (Default </w:t>
+      </w:r>
+      <w:proofErr w:type="spellStart"/>
+      <w:r>
+        <w:rPr>
+          <w:b/>
+          <w:bCs/>
+        </w:rPr>
+        <w:t>Selection</w:t>
+      </w:r>
+      <w:proofErr w:type="spellEnd"/>
+      <w:r>
+        <w:rPr>
+          <w:b/>
+          <w:bCs/>
+        </w:rPr>
+        <w:t xml:space="preserve">) : </w:t>
+      </w:r>
+    </w:p>
+    <w:p>
+      <w:pPr>
+        <w:spacing w:after="0"/>
+      </w:pPr>
+      <w:r>
+        <w:t xml:space="preserve">L’objet dépend des privilèges de l’utilisateur qui </w:t>
+      </w:r>
+      <w:r>
+        <w:rPr>
+          <w:b/>
+          <w:bCs/>
+        </w:rPr>
+        <w:t>l’a créé</w:t>
+      </w:r>
+      <w:r>
+        <w:t>.</w:t>
+      </w:r>
+    </w:p>
+    <w:p>
+      <w:r>
+        <w:t xml:space="preserve">Les permissions nécessaires sont donc celles du DEFINER, même si l’utilisateur qui appelle l’objet n’a pas ces privilèges. </w:t>
+      </w:r>
+    </w:p>
+    <w:p/>
+    <w:p>
+      <w:pPr>
+        <w:spacing w:after="0"/>
+        <w:rPr>
+          <w:b/>
+          <w:bCs/>
+        </w:rPr>
+      </w:pPr>
+      <w:r>
+        <w:rPr>
+          <w:b/>
+          <w:bCs/>
+        </w:rPr>
+        <w:lastRenderedPageBreak/>
+        <w:t>INVOKER :</w:t>
+      </w:r>
+    </w:p>
+    <w:p>
+      <w:pPr>
+        <w:spacing w:after="0"/>
+      </w:pPr>
+      <w:r>
+        <w:t>Objet s’exécute avec privilèges de l’utilisateur qui l’</w:t>
+      </w:r>
+      <w:r>
+        <w:rPr>
+          <w:b/>
+          <w:bCs/>
+        </w:rPr>
+        <w:t>appelle</w:t>
+      </w:r>
+      <w:r>
+        <w:t xml:space="preserve">. </w:t>
+      </w:r>
+    </w:p>
+    <w:p>
+      <w:pPr>
+        <w:rPr>
+          <w:lang w:val="en-US"/>
+        </w:rPr>
+      </w:pPr>
+    </w:p>
+    <w:p>
+      <w:pPr>
+        <w:rPr>
+          <w:lang w:val="en-US"/>
+        </w:rPr>
+      </w:pPr>
+      <w:r>
+        <w:rPr>
+          <w:lang w:val="en-US"/>
+        </w:rPr>
+        <w:t xml:space="preserve">CREATE SQL SECURITY INVOKER VIEW </w:t>
+      </w:r>
+      <w:proofErr w:type="spellStart"/>
+      <w:r>
+        <w:rPr>
+          <w:lang w:val="en-US"/>
+        </w:rPr>
+        <w:t>v_users</w:t>
+      </w:r>
+      <w:proofErr w:type="spellEnd"/>
+      <w:r>
+        <w:rPr>
+          <w:lang w:val="en-US"/>
+        </w:rPr>
+        <w:t xml:space="preserve"> AS</w:t>
+      </w:r>
+    </w:p>
+    <w:p>
+      <w:r>
+        <w:t xml:space="preserve">SELECT * FROM </w:t>
+      </w:r>
+      <w:proofErr w:type="spellStart"/>
+      <w:proofErr w:type="gramStart"/>
+      <w:r>
+        <w:t>users</w:t>
+      </w:r>
+      <w:proofErr w:type="spellEnd"/>
+      <w:r>
+        <w:t>;</w:t>
+      </w:r>
+      <w:proofErr w:type="gramEnd"/>
+    </w:p>
+    <w:p/>
+    <w:p>
+      <w:pPr>
         <w:pStyle w:val="Titre1"/>
       </w:pPr>
       <w:r>
@@ -1177,12 +1432,12 @@
         <w:t>?</w:t>
       </w:r>
     </w:p>
+    <w:p/>
     <w:p>
       <w:pPr>
         <w:pStyle w:val="Titre1"/>
       </w:pPr>
       <w:r>
-        <w:lastRenderedPageBreak/>
         <w:t>Procédure stockée : paramètre IN</w:t>
       </w:r>
     </w:p>
@@ -1199,28 +1454,53 @@
       <w:r>
         <w:t xml:space="preserve">procédure stockée nommée « sp_helloWorld2 » qui affiche « Bonjour </w:t>
       </w:r>
+      <w:proofErr w:type="spellStart"/>
       <w:r>
         <w:rPr>
           <w:i/>
           <w:iCs/>
         </w:rPr>
-        <w:t xml:space="preserve">Nom_saisi ». </w:t>
+        <w:t>Nom_saisi</w:t>
+      </w:r>
+      <w:proofErr w:type="spellEnd"/>
+      <w:r>
+        <w:rPr>
+          <w:i/>
+          <w:iCs/>
+        </w:rPr>
+        <w:t xml:space="preserve"> ». </w:t>
       </w:r>
       <w:r>
         <w:t>Le nom est passé en paramètre de la procédure.</w:t>
       </w:r>
       <w:r>
-        <w:t xml:space="preserve"> Pour concacténer, vous pouvez utiliser la fonction </w:t>
-      </w:r>
+        <w:t xml:space="preserve"> Pour </w:t>
+      </w:r>
+      <w:proofErr w:type="spellStart"/>
+      <w:r>
+        <w:t>concacténer</w:t>
+      </w:r>
+      <w:proofErr w:type="spellEnd"/>
+      <w:r>
+        <w:t xml:space="preserve">, vous pouvez utiliser la fonction </w:t>
+      </w:r>
+      <w:proofErr w:type="gramStart"/>
       <w:r>
         <w:rPr>
           <w:b/>
           <w:bCs/>
         </w:rPr>
-        <w:t>CONCACT().</w:t>
-      </w:r>
-    </w:p>
-    <w:p/>
+        <w:t>CONCACT(</w:t>
+      </w:r>
+      <w:proofErr w:type="gramEnd"/>
+      <w:r>
+        <w:rPr>
+          <w:b/>
+          <w:bCs/>
+        </w:rPr>
+        <w:t>).</w:t>
+      </w:r>
+    </w:p>
     <w:p>
       <w:r>
         <w:t>Tester votre procédure en utilisant :</w:t>
@@ -1235,7 +1515,6 @@
         <w:t>SELECT @message ;</w:t>
       </w:r>
     </w:p>
-    <w:p/>
     <w:p>
       <w:r>
         <w:rPr>
@@ -1248,9 +1527,63 @@
         <w:t>@message crée une variable utilisateur et le select permet d’en afficher le contenu.</w:t>
       </w:r>
     </w:p>
+    <w:p>
+      <w:r>
+        <w:rPr>
+          <w:noProof/>
+        </w:rPr>
+        <w:drawing>
+          <wp:inline distT="0" distB="0" distL="0" distR="0" wp14:anchorId="765E236E" wp14:editId="72CDF602">
+            <wp:extent cx="5103628" cy="1781690"/>
+            <wp:effectExtent l="0" t="0" r="1905" b="9525"/>
+            <wp:docPr id="1737018315" name="Image 1"/>
+            <wp:cNvGraphicFramePr>
+              <a:graphicFrameLocks xmlns:a="http://schemas.openxmlformats.org/drawingml/2006/main" noChangeAspect="1"/>
+            </wp:cNvGraphicFramePr>
+            <a:graphic xmlns:a="http://schemas.openxmlformats.org/drawingml/2006/main">
+              <a:graphicData uri="http://schemas.openxmlformats.org/drawingml/2006/picture">
+                <pic:pic xmlns:pic="http://schemas.openxmlformats.org/drawingml/2006/picture">
+                  <pic:nvPicPr>
+                    <pic:cNvPr id="1737018315" name=""/>
+                    <pic:cNvPicPr/>
+                  </pic:nvPicPr>
+                  <pic:blipFill>
+                    <a:blip r:embed="rId14"/>
+                    <a:stretch>
+                      <a:fillRect/>
+                    </a:stretch>
+                  </pic:blipFill>
+                  <pic:spPr>
+                    <a:xfrm>
+                      <a:off x="0" y="0"/>
+                      <a:ext cx="5114797" cy="1785589"/>
+                    </a:xfrm>
+                    <a:prstGeom prst="rect">
+                      <a:avLst/>
+                    </a:prstGeom>
+                  </pic:spPr>
+                </pic:pic>
+              </a:graphicData>
+            </a:graphic>
+          </wp:inline>
+        </w:drawing>
+      </w:r>
+    </w:p>
+    <w:p>
+      <w:r>
+        <w:t>On assigne des « $$ » au « </w:t>
+      </w:r>
+      <w:proofErr w:type="spellStart"/>
+      <w:r>
+        <w:t>delimiter</w:t>
+      </w:r>
+      <w:proofErr w:type="spellEnd"/>
+      <w:r>
+        <w:t> ».</w:t>
+      </w:r>
+    </w:p>
     <w:p/>
     <w:p/>
-    <w:p/>
     <w:p>
       <w:pPr>
         <w:pStyle w:val="Titre1"/>
@@ -1264,7 +1597,15 @@
         <w:t>Pour accéder à l’utilisateur actuel</w:t>
       </w:r>
       <w:r>
-        <w:t>, vous pouvez utiliser la fonction USER().</w:t>
+        <w:t xml:space="preserve">, vous pouvez utiliser la fonction </w:t>
+      </w:r>
+      <w:proofErr w:type="gramStart"/>
+      <w:r>
+        <w:t>USER(</w:t>
+      </w:r>
+      <w:proofErr w:type="gramEnd"/>
+      <w:r>
+        <w:t>).</w:t>
       </w:r>
     </w:p>
     <w:p>
@@ -1397,7 +1738,21 @@
         <w:rPr>
           <w:rStyle w:val="hljs-keyword"/>
         </w:rPr>
-        <w:t xml:space="preserve">    DECLARE currentUser </w:t>
+        <w:t xml:space="preserve">    DECLARE </w:t>
+      </w:r>
+      <w:proofErr w:type="spellStart"/>
+      <w:r>
+        <w:rPr>
+          <w:rStyle w:val="hljs-keyword"/>
+        </w:rPr>
+        <w:t>currentUser</w:t>
+      </w:r>
+      <w:proofErr w:type="spellEnd"/>
+      <w:r>
+        <w:rPr>
+          <w:rStyle w:val="hljs-keyword"/>
+        </w:rPr>
+        <w:t xml:space="preserve"> </w:t>
       </w:r>
       <w:r>
         <w:rPr>
@@ -1549,21 +1904,37 @@
         <w:rPr>
           <w:lang w:val="en-US"/>
         </w:rPr>
-        <w:t>(@message) ;</w:t>
-      </w:r>
-    </w:p>
-    <w:p>
-      <w:pPr>
-        <w:rPr>
-          <w:lang w:val="en-US"/>
-        </w:rPr>
-      </w:pPr>
-      <w:r>
-        <w:rPr>
-          <w:lang w:val="en-US"/>
-        </w:rPr>
-        <w:t>SELECT @message ;</w:t>
-      </w:r>
+        <w:t>(@message</w:t>
+      </w:r>
+      <w:proofErr w:type="gramStart"/>
+      <w:r>
+        <w:rPr>
+          <w:lang w:val="en-US"/>
+        </w:rPr>
+        <w:t>) ;</w:t>
+      </w:r>
+      <w:proofErr w:type="gramEnd"/>
+    </w:p>
+    <w:p>
+      <w:pPr>
+        <w:rPr>
+          <w:lang w:val="en-US"/>
+        </w:rPr>
+      </w:pPr>
+      <w:r>
+        <w:rPr>
+          <w:lang w:val="en-US"/>
+        </w:rPr>
+        <w:t>SELECT @</w:t>
+      </w:r>
+      <w:proofErr w:type="gramStart"/>
+      <w:r>
+        <w:rPr>
+          <w:lang w:val="en-US"/>
+        </w:rPr>
+        <w:t>message ;</w:t>
+      </w:r>
+      <w:proofErr w:type="gramEnd"/>
     </w:p>
     <w:p>
       <w:pPr>
@@ -1598,7 +1969,11 @@
         <w:t xml:space="preserve"> : </w:t>
       </w:r>
       <w:r>
-        <w:t>Création d’une table t_audit_</w:t>
+        <w:t xml:space="preserve">Création d’une table </w:t>
+      </w:r>
+      <w:proofErr w:type="spellStart"/>
+      <w:r>
+        <w:t>t_audit_</w:t>
       </w:r>
       <w:r>
         <w:t>access_</w:t>
@@ -1606,6 +1981,7 @@
       <w:r>
         <w:t>absences</w:t>
       </w:r>
+      <w:proofErr w:type="spellEnd"/>
     </w:p>
     <w:p>
       <w:r>
@@ -1625,8 +2001,14 @@
       </w:r>
     </w:p>
     <w:p>
-      <w:r>
-        <w:t>t_audit_</w:t>
+      <w:proofErr w:type="spellStart"/>
+      <w:proofErr w:type="gramStart"/>
+      <w:r>
+        <w:t>t</w:t>
+      </w:r>
+      <w:proofErr w:type="gramEnd"/>
+      <w:r>
+        <w:t>_audit_</w:t>
       </w:r>
       <w:r>
         <w:t>access_</w:t>
@@ -1634,8 +2016,13 @@
       <w:r>
         <w:t>absences</w:t>
       </w:r>
-      <w:r>
-        <w:t>(idAu</w:t>
+      <w:proofErr w:type="spellEnd"/>
+      <w:r>
+        <w:t>(</w:t>
+      </w:r>
+      <w:proofErr w:type="spellStart"/>
+      <w:r>
+        <w:t>idAu</w:t>
       </w:r>
       <w:r>
         <w:t>dit</w:t>
@@ -1643,8 +2030,13 @@
       <w:r>
         <w:t>Absences</w:t>
       </w:r>
-      <w:r>
-        <w:t xml:space="preserve"> INT, aud</w:t>
+      <w:proofErr w:type="spellEnd"/>
+      <w:r>
+        <w:t xml:space="preserve"> INT, </w:t>
+      </w:r>
+      <w:proofErr w:type="spellStart"/>
+      <w:r>
+        <w:t>aud</w:t>
       </w:r>
       <w:r>
         <w:t>Abs</w:t>
@@ -1652,6 +2044,7 @@
       <w:r>
         <w:t>Date</w:t>
       </w:r>
+      <w:proofErr w:type="spellEnd"/>
       <w:r>
         <w:t xml:space="preserve"> DATE</w:t>
       </w:r>
@@ -1659,7 +2052,11 @@
         <w:t>TIME</w:t>
       </w:r>
       <w:r>
-        <w:t>, aud</w:t>
+        <w:t xml:space="preserve">, </w:t>
+      </w:r>
+      <w:proofErr w:type="spellStart"/>
+      <w:r>
+        <w:t>aud</w:t>
       </w:r>
       <w:r>
         <w:t>Abs</w:t>
@@ -1667,6 +2064,7 @@
       <w:r>
         <w:t>User</w:t>
       </w:r>
+      <w:proofErr w:type="spellEnd"/>
       <w:r>
         <w:t xml:space="preserve"> VARCHAR(50)</w:t>
       </w:r>
@@ -1676,7 +2074,15 @@
     </w:p>
     <w:p>
       <w:r>
-        <w:t>La clé primaire est un identifiant artificiel autoincrémenté.</w:t>
+        <w:t xml:space="preserve">La clé primaire est un identifiant artificiel </w:t>
+      </w:r>
+      <w:proofErr w:type="spellStart"/>
+      <w:r>
+        <w:t>autoincrémenté</w:t>
+      </w:r>
+      <w:proofErr w:type="spellEnd"/>
+      <w:r>
+        <w:t>.</w:t>
       </w:r>
     </w:p>
     <w:p>
@@ -1698,11 +2104,16 @@
         <w:t>Créer une procédure stockée</w:t>
       </w:r>
       <w:r>
-        <w:t xml:space="preserve"> (sp_get_</w:t>
+        <w:t xml:space="preserve"> (</w:t>
+      </w:r>
+      <w:proofErr w:type="spellStart"/>
+      <w:r>
+        <w:t>sp_get_</w:t>
       </w:r>
       <w:r>
         <w:t>absences</w:t>
       </w:r>
+      <w:proofErr w:type="spellEnd"/>
       <w:r>
         <w:t>)</w:t>
       </w:r>
@@ -1727,12 +2138,14 @@
       <w:r>
         <w:t xml:space="preserve"> </w:t>
       </w:r>
+      <w:proofErr w:type="spellStart"/>
       <w:r>
         <w:t>v_</w:t>
       </w:r>
       <w:r>
         <w:t>absentStudent</w:t>
       </w:r>
+      <w:proofErr w:type="spellEnd"/>
     </w:p>
     <w:p>
       <w:pPr>
@@ -1743,11 +2156,16 @@
         </w:numPr>
       </w:pPr>
       <w:r>
-        <w:t>Insère dans t_audit_</w:t>
+        <w:t xml:space="preserve">Insère dans </w:t>
+      </w:r>
+      <w:proofErr w:type="spellStart"/>
+      <w:r>
+        <w:t>t_audit_</w:t>
       </w:r>
       <w:r>
         <w:t>absences</w:t>
       </w:r>
+      <w:proofErr w:type="spellEnd"/>
       <w:r>
         <w:t> :</w:t>
       </w:r>
@@ -1833,11 +2251,16 @@
         <w:t>uniquement</w:t>
       </w:r>
       <w:r>
-        <w:t xml:space="preserve"> exécuter la procédure sp_</w:t>
+        <w:t xml:space="preserve"> exécuter la procédure </w:t>
+      </w:r>
+      <w:proofErr w:type="spellStart"/>
+      <w:r>
+        <w:t>sp_</w:t>
       </w:r>
       <w:r>
         <w:t>get_absences</w:t>
       </w:r>
+      <w:proofErr w:type="spellEnd"/>
     </w:p>
     <w:p>
       <w:pPr>
@@ -1872,8 +2295,8 @@
     </w:p>
     <w:p/>
     <w:sectPr>
-      <w:headerReference w:type="default" r:id="rId14"/>
-      <w:footerReference w:type="default" r:id="rId15"/>
+      <w:headerReference w:type="default" r:id="rId15"/>
+      <w:footerReference w:type="default" r:id="rId16"/>
       <w:pgSz w:w="11906" w:h="16838"/>
       <w:pgMar w:top="1440" w:right="1440" w:bottom="1440" w:left="1440" w:header="708" w:footer="708" w:gutter="0"/>
       <w:cols w:space="708"/>
@@ -1884,7 +2307,7 @@
 </file>
 
 <file path=word/endnotes.xml><?xml version="1.0" encoding="utf-8"?>
-<w:endnotes xmlns:wpc="http://schemas.microsoft.com/office/word/2010/wordprocessingCanvas" xmlns:cx="http://schemas.microsoft.com/office/drawing/2014/chartex" xmlns:cx1="http://schemas.microsoft.com/office/drawing/2015/9/8/chartex" xmlns:cx2="http://schemas.microsoft.com/office/drawing/2015/10/21/chartex" xmlns:cx3="http://schemas.microsoft.com/office/drawing/2016/5/9/chartex" xmlns:cx4="http://schemas.microsoft.com/office/drawing/2016/5/10/chartex" xmlns:cx5="http://schemas.microsoft.com/office/drawing/2016/5/11/chartex" xmlns:cx6="http://schemas.microsoft.com/office/drawing/2016/5/12/chartex" xmlns:cx7="http://schemas.microsoft.com/office/drawing/2016/5/13/chartex" xmlns:cx8="http://schemas.microsoft.com/office/drawing/2016/5/14/chartex" xmlns:mc="http://schemas.openxmlformats.org/markup-compatibility/2006" xmlns:aink="http://schemas.microsoft.com/office/drawing/2016/ink" xmlns:am3d="http://schemas.microsoft.com/office/drawing/2017/model3d" xmlns:o="urn:schemas-microsoft-com:office:office" xmlns:oel="http://schemas.microsoft.com/office/2019/extlst" xmlns:r="http://schemas.openxmlformats.org/officeDocument/2006/relationships" xmlns:m="http://schemas.openxmlformats.org/officeDocument/2006/math" xmlns:v="urn:schemas-microsoft-com:vml" xmlns:wp14="http://schemas.microsoft.com/office/word/2010/wordprocessingDrawing" xmlns:wp="http://schemas.openxmlformats.org/drawingml/2006/wordprocessingDrawing" xmlns:w10="urn:schemas-microsoft-com:office:word" xmlns:w="http://schemas.openxmlformats.org/wordprocessingml/2006/main" xmlns:w14="http://schemas.microsoft.com/office/word/2010/wordml" xmlns:w15="http://schemas.microsoft.com/office/word/2012/wordml" xmlns:w16cex="http://schemas.microsoft.com/office/word/2018/wordml/cex" xmlns:w16cid="http://schemas.microsoft.com/office/word/2016/wordml/cid" xmlns:w16="http://schemas.microsoft.com/office/word/2018/wordml" xmlns:w16du="http://schemas.microsoft.com/office/word/2023/wordml/word16du" xmlns:w16sdtdh="http://schemas.microsoft.com/office/word/2020/wordml/sdtdatahash" xmlns:w16sdtfl="http://schemas.microsoft.com/office/word/2024/wordml/sdtformatlock" xmlns:w16se="http://schemas.microsoft.com/office/word/2015/wordml/symex" xmlns:wpg="http://schemas.microsoft.com/office/word/2010/wordprocessingGroup" xmlns:wpi="http://schemas.microsoft.com/office/word/2010/wordprocessingInk" xmlns:wne="http://schemas.microsoft.com/office/word/2006/wordml" xmlns:wps="http://schemas.microsoft.com/office/word/2010/wordprocessingShape" mc:Ignorable="w14 w15 w16se w16cid w16 w16cex w16sdtdh w16sdtfl w16du wp14">
+<w:endnotes xmlns:wpc="http://schemas.microsoft.com/office/word/2010/wordprocessingCanvas" xmlns:cx="http://schemas.microsoft.com/office/drawing/2014/chartex" xmlns:cx1="http://schemas.microsoft.com/office/drawing/2015/9/8/chartex" xmlns:cx2="http://schemas.microsoft.com/office/drawing/2015/10/21/chartex" xmlns:cx3="http://schemas.microsoft.com/office/drawing/2016/5/9/chartex" xmlns:cx4="http://schemas.microsoft.com/office/drawing/2016/5/10/chartex" xmlns:cx5="http://schemas.microsoft.com/office/drawing/2016/5/11/chartex" xmlns:cx6="http://schemas.microsoft.com/office/drawing/2016/5/12/chartex" xmlns:cx7="http://schemas.microsoft.com/office/drawing/2016/5/13/chartex" xmlns:cx8="http://schemas.microsoft.com/office/drawing/2016/5/14/chartex" xmlns:mc="http://schemas.openxmlformats.org/markup-compatibility/2006" xmlns:aink="http://schemas.microsoft.com/office/drawing/2016/ink" xmlns:am3d="http://schemas.microsoft.com/office/drawing/2017/model3d" xmlns:o="urn:schemas-microsoft-com:office:office" xmlns:oel="http://schemas.microsoft.com/office/2019/extlst" xmlns:r="http://schemas.openxmlformats.org/officeDocument/2006/relationships" xmlns:m="http://schemas.openxmlformats.org/officeDocument/2006/math" xmlns:v="urn:schemas-microsoft-com:vml" xmlns:wp14="http://schemas.microsoft.com/office/word/2010/wordprocessingDrawing" xmlns:wp="http://schemas.openxmlformats.org/drawingml/2006/wordprocessingDrawing" xmlns:w10="urn:schemas-microsoft-com:office:word" xmlns:w="http://schemas.openxmlformats.org/wordprocessingml/2006/main" xmlns:w14="http://schemas.microsoft.com/office/word/2010/wordml" xmlns:w15="http://schemas.microsoft.com/office/word/2012/wordml" xmlns:w16cex="http://schemas.microsoft.com/office/word/2018/wordml/cex" xmlns:w16cid="http://schemas.microsoft.com/office/word/2016/wordml/cid" xmlns:w16="http://schemas.microsoft.com/office/word/2018/wordml" xmlns:w16sdtdh="http://schemas.microsoft.com/office/word/2020/wordml/sdtdatahash" xmlns:w16se="http://schemas.microsoft.com/office/word/2015/wordml/symex" xmlns:wpg="http://schemas.microsoft.com/office/word/2010/wordprocessingGroup" xmlns:wpi="http://schemas.microsoft.com/office/word/2010/wordprocessingInk" xmlns:wne="http://schemas.microsoft.com/office/word/2006/wordml" xmlns:wps="http://schemas.microsoft.com/office/word/2010/wordprocessingShape" mc:Ignorable="w14 w15 w16se w16cid w16 w16cex w16sdtdh wp14">
   <w:endnote w:type="separator" w:id="-1">
     <w:p>
       <w:pPr>
@@ -1916,7 +2339,7 @@
 </file>
 
 <file path=word/footer1.xml><?xml version="1.0" encoding="utf-8"?>
-<w:ftr xmlns:wpc="http://schemas.microsoft.com/office/word/2010/wordprocessingCanvas" xmlns:cx="http://schemas.microsoft.com/office/drawing/2014/chartex" xmlns:cx1="http://schemas.microsoft.com/office/drawing/2015/9/8/chartex" xmlns:cx2="http://schemas.microsoft.com/office/drawing/2015/10/21/chartex" xmlns:cx3="http://schemas.microsoft.com/office/drawing/2016/5/9/chartex" xmlns:cx4="http://schemas.microsoft.com/office/drawing/2016/5/10/chartex" xmlns:cx5="http://schemas.microsoft.com/office/drawing/2016/5/11/chartex" xmlns:cx6="http://schemas.microsoft.com/office/drawing/2016/5/12/chartex" xmlns:cx7="http://schemas.microsoft.com/office/drawing/2016/5/13/chartex" xmlns:cx8="http://schemas.microsoft.com/office/drawing/2016/5/14/chartex" xmlns:mc="http://schemas.openxmlformats.org/markup-compatibility/2006" xmlns:aink="http://schemas.microsoft.com/office/drawing/2016/ink" xmlns:am3d="http://schemas.microsoft.com/office/drawing/2017/model3d" xmlns:o="urn:schemas-microsoft-com:office:office" xmlns:oel="http://schemas.microsoft.com/office/2019/extlst" xmlns:r="http://schemas.openxmlformats.org/officeDocument/2006/relationships" xmlns:m="http://schemas.openxmlformats.org/officeDocument/2006/math" xmlns:v="urn:schemas-microsoft-com:vml" xmlns:wp14="http://schemas.microsoft.com/office/word/2010/wordprocessingDrawing" xmlns:wp="http://schemas.openxmlformats.org/drawingml/2006/wordprocessingDrawing" xmlns:w10="urn:schemas-microsoft-com:office:word" xmlns:w="http://schemas.openxmlformats.org/wordprocessingml/2006/main" xmlns:w14="http://schemas.microsoft.com/office/word/2010/wordml" xmlns:w15="http://schemas.microsoft.com/office/word/2012/wordml" xmlns:w16cex="http://schemas.microsoft.com/office/word/2018/wordml/cex" xmlns:w16cid="http://schemas.microsoft.com/office/word/2016/wordml/cid" xmlns:w16="http://schemas.microsoft.com/office/word/2018/wordml" xmlns:w16du="http://schemas.microsoft.com/office/word/2023/wordml/word16du" xmlns:w16sdtdh="http://schemas.microsoft.com/office/word/2020/wordml/sdtdatahash" xmlns:w16sdtfl="http://schemas.microsoft.com/office/word/2024/wordml/sdtformatlock" xmlns:w16se="http://schemas.microsoft.com/office/word/2015/wordml/symex" xmlns:wpg="http://schemas.microsoft.com/office/word/2010/wordprocessingGroup" xmlns:wpi="http://schemas.microsoft.com/office/word/2010/wordprocessingInk" xmlns:wne="http://schemas.microsoft.com/office/word/2006/wordml" xmlns:wps="http://schemas.microsoft.com/office/word/2010/wordprocessingShape" mc:Ignorable="w14 w15 w16se w16cid w16 w16cex w16sdtdh w16sdtfl w16du wp14">
+<w:ftr xmlns:wpc="http://schemas.microsoft.com/office/word/2010/wordprocessingCanvas" xmlns:cx="http://schemas.microsoft.com/office/drawing/2014/chartex" xmlns:cx1="http://schemas.microsoft.com/office/drawing/2015/9/8/chartex" xmlns:cx2="http://schemas.microsoft.com/office/drawing/2015/10/21/chartex" xmlns:cx3="http://schemas.microsoft.com/office/drawing/2016/5/9/chartex" xmlns:cx4="http://schemas.microsoft.com/office/drawing/2016/5/10/chartex" xmlns:cx5="http://schemas.microsoft.com/office/drawing/2016/5/11/chartex" xmlns:cx6="http://schemas.microsoft.com/office/drawing/2016/5/12/chartex" xmlns:cx7="http://schemas.microsoft.com/office/drawing/2016/5/13/chartex" xmlns:cx8="http://schemas.microsoft.com/office/drawing/2016/5/14/chartex" xmlns:mc="http://schemas.openxmlformats.org/markup-compatibility/2006" xmlns:aink="http://schemas.microsoft.com/office/drawing/2016/ink" xmlns:am3d="http://schemas.microsoft.com/office/drawing/2017/model3d" xmlns:o="urn:schemas-microsoft-com:office:office" xmlns:oel="http://schemas.microsoft.com/office/2019/extlst" xmlns:r="http://schemas.openxmlformats.org/officeDocument/2006/relationships" xmlns:m="http://schemas.openxmlformats.org/officeDocument/2006/math" xmlns:v="urn:schemas-microsoft-com:vml" xmlns:wp14="http://schemas.microsoft.com/office/word/2010/wordprocessingDrawing" xmlns:wp="http://schemas.openxmlformats.org/drawingml/2006/wordprocessingDrawing" xmlns:w10="urn:schemas-microsoft-com:office:word" xmlns:w="http://schemas.openxmlformats.org/wordprocessingml/2006/main" xmlns:w14="http://schemas.microsoft.com/office/word/2010/wordml" xmlns:w15="http://schemas.microsoft.com/office/word/2012/wordml" xmlns:w16cex="http://schemas.microsoft.com/office/word/2018/wordml/cex" xmlns:w16cid="http://schemas.microsoft.com/office/word/2016/wordml/cid" xmlns:w16="http://schemas.microsoft.com/office/word/2018/wordml" xmlns:w16sdtdh="http://schemas.microsoft.com/office/word/2020/wordml/sdtdatahash" xmlns:w16se="http://schemas.microsoft.com/office/word/2015/wordml/symex" xmlns:wpg="http://schemas.microsoft.com/office/word/2010/wordprocessingGroup" xmlns:wpi="http://schemas.microsoft.com/office/word/2010/wordprocessingInk" xmlns:wne="http://schemas.microsoft.com/office/word/2006/wordml" xmlns:wps="http://schemas.microsoft.com/office/word/2010/wordprocessingShape" mc:Ignorable="w14 w15 w16se w16cid w16 w16cex w16sdtdh wp14">
   <w:tbl>
     <w:tblPr>
       <w:tblW w:w="5000" w:type="pct"/>
@@ -1950,14 +2373,34 @@
               <w:lang w:val="de-CH"/>
             </w:rPr>
           </w:pPr>
+          <w:proofErr w:type="spellStart"/>
           <w:r>
             <w:rPr>
               <w:rFonts w:ascii="Century Gothic" w:hAnsi="Century Gothic" w:cs="Arial"/>
               <w:szCs w:val="16"/>
               <w:lang w:val="de-CH"/>
             </w:rPr>
-            <w:t>Procédures stockées</w:t>
+            <w:t>Procédures</w:t>
           </w:r>
+          <w:proofErr w:type="spellEnd"/>
+          <w:r>
+            <w:rPr>
+              <w:rFonts w:ascii="Century Gothic" w:hAnsi="Century Gothic" w:cs="Arial"/>
+              <w:szCs w:val="16"/>
+              <w:lang w:val="de-CH"/>
+            </w:rPr>
+            <w:t xml:space="preserve"> </w:t>
+          </w:r>
+          <w:proofErr w:type="spellStart"/>
+          <w:r>
+            <w:rPr>
+              <w:rFonts w:ascii="Century Gothic" w:hAnsi="Century Gothic" w:cs="Arial"/>
+              <w:szCs w:val="16"/>
+              <w:lang w:val="de-CH"/>
+            </w:rPr>
+            <w:t>stockées</w:t>
+          </w:r>
+          <w:proofErr w:type="spellEnd"/>
         </w:p>
       </w:tc>
       <w:tc>
@@ -2143,7 +2586,7 @@
 </file>
 
 <file path=word/footnotes.xml><?xml version="1.0" encoding="utf-8"?>
-<w:footnotes xmlns:wpc="http://schemas.microsoft.com/office/word/2010/wordprocessingCanvas" xmlns:cx="http://schemas.microsoft.com/office/drawing/2014/chartex" xmlns:cx1="http://schemas.microsoft.com/office/drawing/2015/9/8/chartex" xmlns:cx2="http://schemas.microsoft.com/office/drawing/2015/10/21/chartex" xmlns:cx3="http://schemas.microsoft.com/office/drawing/2016/5/9/chartex" xmlns:cx4="http://schemas.microsoft.com/office/drawing/2016/5/10/chartex" xmlns:cx5="http://schemas.microsoft.com/office/drawing/2016/5/11/chartex" xmlns:cx6="http://schemas.microsoft.com/office/drawing/2016/5/12/chartex" xmlns:cx7="http://schemas.microsoft.com/office/drawing/2016/5/13/chartex" xmlns:cx8="http://schemas.microsoft.com/office/drawing/2016/5/14/chartex" xmlns:mc="http://schemas.openxmlformats.org/markup-compatibility/2006" xmlns:aink="http://schemas.microsoft.com/office/drawing/2016/ink" xmlns:am3d="http://schemas.microsoft.com/office/drawing/2017/model3d" xmlns:o="urn:schemas-microsoft-com:office:office" xmlns:oel="http://schemas.microsoft.com/office/2019/extlst" xmlns:r="http://schemas.openxmlformats.org/officeDocument/2006/relationships" xmlns:m="http://schemas.openxmlformats.org/officeDocument/2006/math" xmlns:v="urn:schemas-microsoft-com:vml" xmlns:wp14="http://schemas.microsoft.com/office/word/2010/wordprocessingDrawing" xmlns:wp="http://schemas.openxmlformats.org/drawingml/2006/wordprocessingDrawing" xmlns:w10="urn:schemas-microsoft-com:office:word" xmlns:w="http://schemas.openxmlformats.org/wordprocessingml/2006/main" xmlns:w14="http://schemas.microsoft.com/office/word/2010/wordml" xmlns:w15="http://schemas.microsoft.com/office/word/2012/wordml" xmlns:w16cex="http://schemas.microsoft.com/office/word/2018/wordml/cex" xmlns:w16cid="http://schemas.microsoft.com/office/word/2016/wordml/cid" xmlns:w16="http://schemas.microsoft.com/office/word/2018/wordml" xmlns:w16du="http://schemas.microsoft.com/office/word/2023/wordml/word16du" xmlns:w16sdtdh="http://schemas.microsoft.com/office/word/2020/wordml/sdtdatahash" xmlns:w16sdtfl="http://schemas.microsoft.com/office/word/2024/wordml/sdtformatlock" xmlns:w16se="http://schemas.microsoft.com/office/word/2015/wordml/symex" xmlns:wpg="http://schemas.microsoft.com/office/word/2010/wordprocessingGroup" xmlns:wpi="http://schemas.microsoft.com/office/word/2010/wordprocessingInk" xmlns:wne="http://schemas.microsoft.com/office/word/2006/wordml" xmlns:wps="http://schemas.microsoft.com/office/word/2010/wordprocessingShape" mc:Ignorable="w14 w15 w16se w16cid w16 w16cex w16sdtdh w16sdtfl w16du wp14">
+<w:footnotes xmlns:wpc="http://schemas.microsoft.com/office/word/2010/wordprocessingCanvas" xmlns:cx="http://schemas.microsoft.com/office/drawing/2014/chartex" xmlns:cx1="http://schemas.microsoft.com/office/drawing/2015/9/8/chartex" xmlns:cx2="http://schemas.microsoft.com/office/drawing/2015/10/21/chartex" xmlns:cx3="http://schemas.microsoft.com/office/drawing/2016/5/9/chartex" xmlns:cx4="http://schemas.microsoft.com/office/drawing/2016/5/10/chartex" xmlns:cx5="http://schemas.microsoft.com/office/drawing/2016/5/11/chartex" xmlns:cx6="http://schemas.microsoft.com/office/drawing/2016/5/12/chartex" xmlns:cx7="http://schemas.microsoft.com/office/drawing/2016/5/13/chartex" xmlns:cx8="http://schemas.microsoft.com/office/drawing/2016/5/14/chartex" xmlns:mc="http://schemas.openxmlformats.org/markup-compatibility/2006" xmlns:aink="http://schemas.microsoft.com/office/drawing/2016/ink" xmlns:am3d="http://schemas.microsoft.com/office/drawing/2017/model3d" xmlns:o="urn:schemas-microsoft-com:office:office" xmlns:oel="http://schemas.microsoft.com/office/2019/extlst" xmlns:r="http://schemas.openxmlformats.org/officeDocument/2006/relationships" xmlns:m="http://schemas.openxmlformats.org/officeDocument/2006/math" xmlns:v="urn:schemas-microsoft-com:vml" xmlns:wp14="http://schemas.microsoft.com/office/word/2010/wordprocessingDrawing" xmlns:wp="http://schemas.openxmlformats.org/drawingml/2006/wordprocessingDrawing" xmlns:w10="urn:schemas-microsoft-com:office:word" xmlns:w="http://schemas.openxmlformats.org/wordprocessingml/2006/main" xmlns:w14="http://schemas.microsoft.com/office/word/2010/wordml" xmlns:w15="http://schemas.microsoft.com/office/word/2012/wordml" xmlns:w16cex="http://schemas.microsoft.com/office/word/2018/wordml/cex" xmlns:w16cid="http://schemas.microsoft.com/office/word/2016/wordml/cid" xmlns:w16="http://schemas.microsoft.com/office/word/2018/wordml" xmlns:w16sdtdh="http://schemas.microsoft.com/office/word/2020/wordml/sdtdatahash" xmlns:w16se="http://schemas.microsoft.com/office/word/2015/wordml/symex" xmlns:wpg="http://schemas.microsoft.com/office/word/2010/wordprocessingGroup" xmlns:wpi="http://schemas.microsoft.com/office/word/2010/wordprocessingInk" xmlns:wne="http://schemas.microsoft.com/office/word/2006/wordml" xmlns:wps="http://schemas.microsoft.com/office/word/2010/wordprocessingShape" mc:Ignorable="w14 w15 w16se w16cid w16 w16cex w16sdtdh wp14">
   <w:footnote w:type="separator" w:id="-1">
     <w:p>
       <w:pPr>
@@ -2175,7 +2618,7 @@
 </file>
 
 <file path=word/header1.xml><?xml version="1.0" encoding="utf-8"?>
-<w:hdr xmlns:wpc="http://schemas.microsoft.com/office/word/2010/wordprocessingCanvas" xmlns:cx="http://schemas.microsoft.com/office/drawing/2014/chartex" xmlns:cx1="http://schemas.microsoft.com/office/drawing/2015/9/8/chartex" xmlns:cx2="http://schemas.microsoft.com/office/drawing/2015/10/21/chartex" xmlns:cx3="http://schemas.microsoft.com/office/drawing/2016/5/9/chartex" xmlns:cx4="http://schemas.microsoft.com/office/drawing/2016/5/10/chartex" xmlns:cx5="http://schemas.microsoft.com/office/drawing/2016/5/11/chartex" xmlns:cx6="http://schemas.microsoft.com/office/drawing/2016/5/12/chartex" xmlns:cx7="http://schemas.microsoft.com/office/drawing/2016/5/13/chartex" xmlns:cx8="http://schemas.microsoft.com/office/drawing/2016/5/14/chartex" xmlns:mc="http://schemas.openxmlformats.org/markup-compatibility/2006" xmlns:aink="http://schemas.microsoft.com/office/drawing/2016/ink" xmlns:am3d="http://schemas.microsoft.com/office/drawing/2017/model3d" xmlns:o="urn:schemas-microsoft-com:office:office" xmlns:oel="http://schemas.microsoft.com/office/2019/extlst" xmlns:r="http://schemas.openxmlformats.org/officeDocument/2006/relationships" xmlns:m="http://schemas.openxmlformats.org/officeDocument/2006/math" xmlns:v="urn:schemas-microsoft-com:vml" xmlns:wp14="http://schemas.microsoft.com/office/word/2010/wordprocessingDrawing" xmlns:wp="http://schemas.openxmlformats.org/drawingml/2006/wordprocessingDrawing" xmlns:w10="urn:schemas-microsoft-com:office:word" xmlns:w="http://schemas.openxmlformats.org/wordprocessingml/2006/main" xmlns:w14="http://schemas.microsoft.com/office/word/2010/wordml" xmlns:w15="http://schemas.microsoft.com/office/word/2012/wordml" xmlns:w16cex="http://schemas.microsoft.com/office/word/2018/wordml/cex" xmlns:w16cid="http://schemas.microsoft.com/office/word/2016/wordml/cid" xmlns:w16="http://schemas.microsoft.com/office/word/2018/wordml" xmlns:w16du="http://schemas.microsoft.com/office/word/2023/wordml/word16du" xmlns:w16sdtdh="http://schemas.microsoft.com/office/word/2020/wordml/sdtdatahash" xmlns:w16sdtfl="http://schemas.microsoft.com/office/word/2024/wordml/sdtformatlock" xmlns:w16se="http://schemas.microsoft.com/office/word/2015/wordml/symex" xmlns:wpg="http://schemas.microsoft.com/office/word/2010/wordprocessingGroup" xmlns:wpi="http://schemas.microsoft.com/office/word/2010/wordprocessingInk" xmlns:wne="http://schemas.microsoft.com/office/word/2006/wordml" xmlns:wps="http://schemas.microsoft.com/office/word/2010/wordprocessingShape" mc:Ignorable="w14 w15 w16se w16cid w16 w16cex w16sdtdh w16sdtfl w16du wp14">
+<w:hdr xmlns:wpc="http://schemas.microsoft.com/office/word/2010/wordprocessingCanvas" xmlns:cx="http://schemas.microsoft.com/office/drawing/2014/chartex" xmlns:cx1="http://schemas.microsoft.com/office/drawing/2015/9/8/chartex" xmlns:cx2="http://schemas.microsoft.com/office/drawing/2015/10/21/chartex" xmlns:cx3="http://schemas.microsoft.com/office/drawing/2016/5/9/chartex" xmlns:cx4="http://schemas.microsoft.com/office/drawing/2016/5/10/chartex" xmlns:cx5="http://schemas.microsoft.com/office/drawing/2016/5/11/chartex" xmlns:cx6="http://schemas.microsoft.com/office/drawing/2016/5/12/chartex" xmlns:cx7="http://schemas.microsoft.com/office/drawing/2016/5/13/chartex" xmlns:cx8="http://schemas.microsoft.com/office/drawing/2016/5/14/chartex" xmlns:mc="http://schemas.openxmlformats.org/markup-compatibility/2006" xmlns:aink="http://schemas.microsoft.com/office/drawing/2016/ink" xmlns:am3d="http://schemas.microsoft.com/office/drawing/2017/model3d" xmlns:o="urn:schemas-microsoft-com:office:office" xmlns:oel="http://schemas.microsoft.com/office/2019/extlst" xmlns:r="http://schemas.openxmlformats.org/officeDocument/2006/relationships" xmlns:m="http://schemas.openxmlformats.org/officeDocument/2006/math" xmlns:v="urn:schemas-microsoft-com:vml" xmlns:wp14="http://schemas.microsoft.com/office/word/2010/wordprocessingDrawing" xmlns:wp="http://schemas.openxmlformats.org/drawingml/2006/wordprocessingDrawing" xmlns:w10="urn:schemas-microsoft-com:office:word" xmlns:w="http://schemas.openxmlformats.org/wordprocessingml/2006/main" xmlns:w14="http://schemas.microsoft.com/office/word/2010/wordml" xmlns:w15="http://schemas.microsoft.com/office/word/2012/wordml" xmlns:w16cex="http://schemas.microsoft.com/office/word/2018/wordml/cex" xmlns:w16cid="http://schemas.microsoft.com/office/word/2016/wordml/cid" xmlns:w16="http://schemas.microsoft.com/office/word/2018/wordml" xmlns:w16sdtdh="http://schemas.microsoft.com/office/word/2020/wordml/sdtdatahash" xmlns:w16se="http://schemas.microsoft.com/office/word/2015/wordml/symex" xmlns:wpg="http://schemas.microsoft.com/office/word/2010/wordprocessingGroup" xmlns:wpi="http://schemas.microsoft.com/office/word/2010/wordprocessingInk" xmlns:wne="http://schemas.microsoft.com/office/word/2006/wordml" xmlns:wps="http://schemas.microsoft.com/office/word/2010/wordprocessingShape" mc:Ignorable="w14 w15 w16se w16cid w16 w16cex w16sdtdh wp14">
   <w:tbl>
     <w:tblPr>
       <w:tblW w:w="5000" w:type="pct"/>
@@ -2386,7 +2829,7 @@
 </file>
 
 <file path=word/numbering.xml><?xml version="1.0" encoding="utf-8"?>
-<w:numbering xmlns:wpc="http://schemas.microsoft.com/office/word/2010/wordprocessingCanvas" xmlns:cx="http://schemas.microsoft.com/office/drawing/2014/chartex" xmlns:cx1="http://schemas.microsoft.com/office/drawing/2015/9/8/chartex" xmlns:cx2="http://schemas.microsoft.com/office/drawing/2015/10/21/chartex" xmlns:cx3="http://schemas.microsoft.com/office/drawing/2016/5/9/chartex" xmlns:cx4="http://schemas.microsoft.com/office/drawing/2016/5/10/chartex" xmlns:cx5="http://schemas.microsoft.com/office/drawing/2016/5/11/chartex" xmlns:cx6="http://schemas.microsoft.com/office/drawing/2016/5/12/chartex" xmlns:cx7="http://schemas.microsoft.com/office/drawing/2016/5/13/chartex" xmlns:cx8="http://schemas.microsoft.com/office/drawing/2016/5/14/chartex" xmlns:mc="http://schemas.openxmlformats.org/markup-compatibility/2006" xmlns:aink="http://schemas.microsoft.com/office/drawing/2016/ink" xmlns:am3d="http://schemas.microsoft.com/office/drawing/2017/model3d" xmlns:o="urn:schemas-microsoft-com:office:office" xmlns:oel="http://schemas.microsoft.com/office/2019/extlst" xmlns:r="http://schemas.openxmlformats.org/officeDocument/2006/relationships" xmlns:m="http://schemas.openxmlformats.org/officeDocument/2006/math" xmlns:v="urn:schemas-microsoft-com:vml" xmlns:wp14="http://schemas.microsoft.com/office/word/2010/wordprocessingDrawing" xmlns:wp="http://schemas.openxmlformats.org/drawingml/2006/wordprocessingDrawing" xmlns:w10="urn:schemas-microsoft-com:office:word" xmlns:w="http://schemas.openxmlformats.org/wordprocessingml/2006/main" xmlns:w14="http://schemas.microsoft.com/office/word/2010/wordml" xmlns:w15="http://schemas.microsoft.com/office/word/2012/wordml" xmlns:w16cex="http://schemas.microsoft.com/office/word/2018/wordml/cex" xmlns:w16cid="http://schemas.microsoft.com/office/word/2016/wordml/cid" xmlns:w16="http://schemas.microsoft.com/office/word/2018/wordml" xmlns:w16du="http://schemas.microsoft.com/office/word/2023/wordml/word16du" xmlns:w16sdtdh="http://schemas.microsoft.com/office/word/2020/wordml/sdtdatahash" xmlns:w16sdtfl="http://schemas.microsoft.com/office/word/2024/wordml/sdtformatlock" xmlns:w16se="http://schemas.microsoft.com/office/word/2015/wordml/symex" xmlns:wpg="http://schemas.microsoft.com/office/word/2010/wordprocessingGroup" xmlns:wpi="http://schemas.microsoft.com/office/word/2010/wordprocessingInk" xmlns:wne="http://schemas.microsoft.com/office/word/2006/wordml" xmlns:wps="http://schemas.microsoft.com/office/word/2010/wordprocessingShape" mc:Ignorable="w14 w15 w16se w16cid w16 w16cex w16sdtdh w16sdtfl w16du wp14">
+<w:numbering xmlns:wpc="http://schemas.microsoft.com/office/word/2010/wordprocessingCanvas" xmlns:cx="http://schemas.microsoft.com/office/drawing/2014/chartex" xmlns:cx1="http://schemas.microsoft.com/office/drawing/2015/9/8/chartex" xmlns:cx2="http://schemas.microsoft.com/office/drawing/2015/10/21/chartex" xmlns:cx3="http://schemas.microsoft.com/office/drawing/2016/5/9/chartex" xmlns:cx4="http://schemas.microsoft.com/office/drawing/2016/5/10/chartex" xmlns:cx5="http://schemas.microsoft.com/office/drawing/2016/5/11/chartex" xmlns:cx6="http://schemas.microsoft.com/office/drawing/2016/5/12/chartex" xmlns:cx7="http://schemas.microsoft.com/office/drawing/2016/5/13/chartex" xmlns:cx8="http://schemas.microsoft.com/office/drawing/2016/5/14/chartex" xmlns:mc="http://schemas.openxmlformats.org/markup-compatibility/2006" xmlns:aink="http://schemas.microsoft.com/office/drawing/2016/ink" xmlns:am3d="http://schemas.microsoft.com/office/drawing/2017/model3d" xmlns:o="urn:schemas-microsoft-com:office:office" xmlns:oel="http://schemas.microsoft.com/office/2019/extlst" xmlns:r="http://schemas.openxmlformats.org/officeDocument/2006/relationships" xmlns:m="http://schemas.openxmlformats.org/officeDocument/2006/math" xmlns:v="urn:schemas-microsoft-com:vml" xmlns:wp14="http://schemas.microsoft.com/office/word/2010/wordprocessingDrawing" xmlns:wp="http://schemas.openxmlformats.org/drawingml/2006/wordprocessingDrawing" xmlns:w10="urn:schemas-microsoft-com:office:word" xmlns:w="http://schemas.openxmlformats.org/wordprocessingml/2006/main" xmlns:w14="http://schemas.microsoft.com/office/word/2010/wordml" xmlns:w15="http://schemas.microsoft.com/office/word/2012/wordml" xmlns:w16cex="http://schemas.microsoft.com/office/word/2018/wordml/cex" xmlns:w16cid="http://schemas.microsoft.com/office/word/2016/wordml/cid" xmlns:w16="http://schemas.microsoft.com/office/word/2018/wordml" xmlns:w16sdtdh="http://schemas.microsoft.com/office/word/2020/wordml/sdtdatahash" xmlns:w16se="http://schemas.microsoft.com/office/word/2015/wordml/symex" xmlns:wpg="http://schemas.microsoft.com/office/word/2010/wordprocessingGroup" xmlns:wpi="http://schemas.microsoft.com/office/word/2010/wordprocessingInk" xmlns:wne="http://schemas.microsoft.com/office/word/2006/wordml" xmlns:wps="http://schemas.microsoft.com/office/word/2010/wordprocessingShape" mc:Ignorable="w14 w15 w16se w16cid w16 w16cex w16sdtdh wp14">
   <w:abstractNum w:abstractNumId="0" w15:restartNumberingAfterBreak="0">
     <w:nsid w:val="1E37601B"/>
     <w:multiLevelType w:val="hybridMultilevel"/>
@@ -2809,7 +3252,7 @@
 </file>
 
 <file path=word/styles.xml><?xml version="1.0" encoding="utf-8"?>
-<w:styles xmlns:mc="http://schemas.openxmlformats.org/markup-compatibility/2006" xmlns:r="http://schemas.openxmlformats.org/officeDocument/2006/relationships" xmlns:w="http://schemas.openxmlformats.org/wordprocessingml/2006/main" xmlns:w14="http://schemas.microsoft.com/office/word/2010/wordml" xmlns:w15="http://schemas.microsoft.com/office/word/2012/wordml" xmlns:w16cex="http://schemas.microsoft.com/office/word/2018/wordml/cex" xmlns:w16cid="http://schemas.microsoft.com/office/word/2016/wordml/cid" xmlns:w16="http://schemas.microsoft.com/office/word/2018/wordml" xmlns:w16du="http://schemas.microsoft.com/office/word/2023/wordml/word16du" xmlns:w16sdtdh="http://schemas.microsoft.com/office/word/2020/wordml/sdtdatahash" xmlns:w16sdtfl="http://schemas.microsoft.com/office/word/2024/wordml/sdtformatlock" xmlns:w16se="http://schemas.microsoft.com/office/word/2015/wordml/symex" mc:Ignorable="w14 w15 w16se w16cid w16 w16cex w16sdtdh w16sdtfl w16du">
+<w:styles xmlns:mc="http://schemas.openxmlformats.org/markup-compatibility/2006" xmlns:r="http://schemas.openxmlformats.org/officeDocument/2006/relationships" xmlns:w="http://schemas.openxmlformats.org/wordprocessingml/2006/main" xmlns:w14="http://schemas.microsoft.com/office/word/2010/wordml" xmlns:w15="http://schemas.microsoft.com/office/word/2012/wordml" xmlns:w16cex="http://schemas.microsoft.com/office/word/2018/wordml/cex" xmlns:w16cid="http://schemas.microsoft.com/office/word/2016/wordml/cid" xmlns:w16="http://schemas.microsoft.com/office/word/2018/wordml" xmlns:w16sdtdh="http://schemas.microsoft.com/office/word/2020/wordml/sdtdatahash" xmlns:w16se="http://schemas.microsoft.com/office/word/2015/wordml/symex" mc:Ignorable="w14 w15 w16se w16cid w16 w16cex w16sdtdh">
   <w:docDefaults>
     <w:rPrDefault>
       <w:rPr>
@@ -3671,6 +4114,18 @@
       <w:shd w:val="clear" w:color="auto" w:fill="E1DFDD"/>
     </w:rPr>
   </w:style>
+  <w:style w:type="character" w:styleId="Lienhypertextesuivivisit">
+    <w:name w:val="FollowedHyperlink"/>
+    <w:basedOn w:val="Policepardfaut"/>
+    <w:uiPriority w:val="99"/>
+    <w:semiHidden/>
+    <w:unhideWhenUsed/>
+    <w:rsid w:val="00814506"/>
+    <w:rPr>
+      <w:color w:val="954F72" w:themeColor="followedHyperlink"/>
+      <w:u w:val="single"/>
+    </w:rPr>
+  </w:style>
 </w:styles>
 </file>
 
@@ -3970,6 +4425,17 @@
 </file>
 
 <file path=customXml/item1.xml><?xml version="1.0" encoding="utf-8"?>
+<p:properties xmlns:p="http://schemas.microsoft.com/office/2006/metadata/properties" xmlns:xsi="http://www.w3.org/2001/XMLSchema-instance" xmlns:pc="http://schemas.microsoft.com/office/infopath/2007/PartnerControls">
+  <documentManagement>
+    <lcf76f155ced4ddcb4097134ff3c332f xmlns="99ffe1f3-7857-457f-add0-5bdef636f38d">
+      <Terms xmlns="http://schemas.microsoft.com/office/infopath/2007/PartnerControls"/>
+    </lcf76f155ced4ddcb4097134ff3c332f>
+    <TaxCatchAll xmlns="be0d3259-a7ce-4623-88ec-81594dfcbc1c" xsi:nil="true"/>
+  </documentManagement>
+</p:properties>
+</file>
+
+<file path=customXml/item2.xml><?xml version="1.0" encoding="utf-8"?>
 <ct:contentTypeSchema xmlns:ct="http://schemas.microsoft.com/office/2006/metadata/contentType" xmlns:ma="http://schemas.microsoft.com/office/2006/metadata/properties/metaAttributes" ct:_="" ma:_="" ma:contentTypeName="Document" ma:contentTypeID="0x010100D4F20F00DBE2EE49BE9523363A2DF18B" ma:contentTypeVersion="14" ma:contentTypeDescription="Crée un document." ma:contentTypeScope="" ma:versionID="5aece811311ae3a0f23154dc9084e92c">
   <xsd:schema xmlns:xsd="http://www.w3.org/2001/XMLSchema" xmlns:xs="http://www.w3.org/2001/XMLSchema" xmlns:p="http://schemas.microsoft.com/office/2006/metadata/properties" xmlns:ns2="99ffe1f3-7857-457f-add0-5bdef636f38d" xmlns:ns3="be0d3259-a7ce-4623-88ec-81594dfcbc1c" targetNamespace="http://schemas.microsoft.com/office/2006/metadata/properties" ma:root="true" ma:fieldsID="df3d6b7f2720f122b401ffb13b8f26d7" ns2:_="" ns3:_="">
     <xsd:import namespace="99ffe1f3-7857-457f-add0-5bdef636f38d"/>
@@ -4198,17 +4664,6 @@
 </ct:contentTypeSchema>
 </file>
 
-<file path=customXml/item2.xml><?xml version="1.0" encoding="utf-8"?>
-<p:properties xmlns:p="http://schemas.microsoft.com/office/2006/metadata/properties" xmlns:xsi="http://www.w3.org/2001/XMLSchema-instance" xmlns:pc="http://schemas.microsoft.com/office/infopath/2007/PartnerControls">
-  <documentManagement>
-    <lcf76f155ced4ddcb4097134ff3c332f xmlns="99ffe1f3-7857-457f-add0-5bdef636f38d">
-      <Terms xmlns="http://schemas.microsoft.com/office/infopath/2007/PartnerControls"/>
-    </lcf76f155ced4ddcb4097134ff3c332f>
-    <TaxCatchAll xmlns="be0d3259-a7ce-4623-88ec-81594dfcbc1c" xsi:nil="true"/>
-  </documentManagement>
-</p:properties>
-</file>
-
 <file path=customXml/item3.xml><?xml version="1.0" encoding="utf-8"?>
 <?mso-contentType ?>
 <FormTemplates xmlns="http://schemas.microsoft.com/sharepoint/v3/contenttype/forms">
@@ -4219,6 +4674,17 @@
 </file>
 
 <file path=customXml/itemProps1.xml><?xml version="1.0" encoding="utf-8"?>
+<ds:datastoreItem xmlns:ds="http://schemas.openxmlformats.org/officeDocument/2006/customXml" ds:itemID="{ADD07E45-6B14-40F8-918D-2557BDE72A70}">
+  <ds:schemaRefs>
+    <ds:schemaRef ds:uri="http://schemas.microsoft.com/office/2006/metadata/properties"/>
+    <ds:schemaRef ds:uri="http://schemas.microsoft.com/office/infopath/2007/PartnerControls"/>
+    <ds:schemaRef ds:uri="99ffe1f3-7857-457f-add0-5bdef636f38d"/>
+    <ds:schemaRef ds:uri="be0d3259-a7ce-4623-88ec-81594dfcbc1c"/>
+  </ds:schemaRefs>
+</ds:datastoreItem>
+</file>
+
+<file path=customXml/itemProps2.xml><?xml version="1.0" encoding="utf-8"?>
 <ds:datastoreItem xmlns:ds="http://schemas.openxmlformats.org/officeDocument/2006/customXml" ds:itemID="{03B08F4F-0844-4376-A02D-2176D5B8BDA1}">
   <ds:schemaRefs>
     <ds:schemaRef ds:uri="http://schemas.microsoft.com/office/2006/metadata/contentType"/>
@@ -4237,17 +4703,6 @@
 </ds:datastoreItem>
 </file>
 
-<file path=customXml/itemProps2.xml><?xml version="1.0" encoding="utf-8"?>
-<ds:datastoreItem xmlns:ds="http://schemas.openxmlformats.org/officeDocument/2006/customXml" ds:itemID="{ADD07E45-6B14-40F8-918D-2557BDE72A70}">
-  <ds:schemaRefs>
-    <ds:schemaRef ds:uri="http://schemas.microsoft.com/office/2006/metadata/properties"/>
-    <ds:schemaRef ds:uri="http://schemas.microsoft.com/office/infopath/2007/PartnerControls"/>
-    <ds:schemaRef ds:uri="99ffe1f3-7857-457f-add0-5bdef636f38d"/>
-    <ds:schemaRef ds:uri="be0d3259-a7ce-4623-88ec-81594dfcbc1c"/>
-  </ds:schemaRefs>
-</ds:datastoreItem>
-</file>
-
 <file path=customXml/itemProps3.xml><?xml version="1.0" encoding="utf-8"?>
 <ds:datastoreItem xmlns:ds="http://schemas.openxmlformats.org/officeDocument/2006/customXml" ds:itemID="{17DE6C1C-B723-4EE3-A401-76D6EAE8EFCC}">
   <ds:schemaRefs>

</xml_diff>